<commit_message>
Phước Thịnh commit lab 3 2209
</commit_message>
<xml_diff>
--- a/LAB3/11TMDT-LAB3_1150070040-NguyenPhuocThinh.docx
+++ b/LAB3/11TMDT-LAB3_1150070040-NguyenPhuocThinh.docx
@@ -73,6 +73,17 @@
         </w:rPr>
         <w:t>Link ytb:</w:t>
       </w:r>
+      <w:r>
+        <w:t xml:space="preserve"> </w:t>
+      </w:r>
+      <w:r>
+        <w:rPr>
+          <w:rFonts w:ascii="Times New Roman" w:hAnsi="Times New Roman" w:cs="Times New Roman"/>
+          <w:color w:val="000000"/>
+          <w:sz w:val="26"/>
+        </w:rPr>
+        <w:t>https://www.youtube.com/watch?v=OYgzuUHa0d8&amp;t=4s</w:t>
+      </w:r>
     </w:p>
     <w:p>
       <w:pPr>
@@ -132,11 +143,12 @@
       <w:r>
         <w:rPr>
           <w:rFonts w:ascii="Times New Roman" w:hAnsi="Times New Roman" w:cs="Times New Roman"/>
+          <w:noProof/>
           <w:color w:val="000000"/>
           <w:sz w:val="26"/>
         </w:rPr>
         <w:drawing>
-          <wp:inline distT="0" distB="0" distL="0" distR="0" wp14:anchorId="3269935D" wp14:editId="45FB488B">
+          <wp:inline distT="0" distB="0" distL="0" distR="0" wp14:anchorId="3269935D" wp14:editId="272F509C">
             <wp:extent cx="5943600" cy="3343275"/>
             <wp:effectExtent l="0" t="0" r="0" b="9525"/>
             <wp:docPr id="1161749822" name="Picture 2" descr="A screenshot of a computer&#10;&#10;AI-generated content may be incorrect."/>
@@ -713,6 +725,7 @@
       <w:r>
         <w:rPr>
           <w:rFonts w:ascii="Times New Roman" w:hAnsi="Times New Roman" w:cs="Times New Roman"/>
+          <w:noProof/>
           <w:color w:val="000000"/>
           <w:sz w:val="26"/>
         </w:rPr>
@@ -1428,6 +1441,7 @@
       <w:r>
         <w:rPr>
           <w:rFonts w:ascii="Times New Roman" w:hAnsi="Times New Roman" w:cs="Times New Roman"/>
+          <w:noProof/>
           <w:color w:val="000000"/>
           <w:sz w:val="26"/>
         </w:rPr>
@@ -4294,6 +4308,7 @@
   <w:style w:type="character" w:default="1" w:styleId="DefaultParagraphFont">
     <w:name w:val="Default Paragraph Font"/>
     <w:uiPriority w:val="1"/>
+    <w:semiHidden/>
     <w:unhideWhenUsed/>
   </w:style>
   <w:style w:type="table" w:default="1" w:styleId="TableNormal">

</xml_diff>

<commit_message>
P THịnh Commit 2209
</commit_message>
<xml_diff>
--- a/LAB3/11TMDT-LAB3_1150070040-NguyenPhuocThinh.docx
+++ b/LAB3/11TMDT-LAB3_1150070040-NguyenPhuocThinh.docx
@@ -71,18 +71,7 @@
           <w:color w:val="000000"/>
           <w:sz w:val="26"/>
         </w:rPr>
-        <w:t>Link ytb:</w:t>
-      </w:r>
-      <w:r>
-        <w:t xml:space="preserve"> </w:t>
-      </w:r>
-      <w:r>
-        <w:rPr>
-          <w:rFonts w:ascii="Times New Roman" w:hAnsi="Times New Roman" w:cs="Times New Roman"/>
-          <w:color w:val="000000"/>
-          <w:sz w:val="26"/>
-        </w:rPr>
-        <w:t>https://www.youtube.com/watch?v=OYgzuUHa0d8&amp;t=4s</w:t>
+        <w:t>Link ytb: https://youtu.be/pYhIRwxrt_Y</w:t>
       </w:r>
     </w:p>
     <w:p>
@@ -148,7 +137,7 @@
           <w:sz w:val="26"/>
         </w:rPr>
         <w:drawing>
-          <wp:inline distT="0" distB="0" distL="0" distR="0" wp14:anchorId="3269935D" wp14:editId="272F509C">
+          <wp:inline distT="0" distB="0" distL="0" distR="0" wp14:anchorId="3269935D" wp14:editId="5B544ECF">
             <wp:extent cx="5943600" cy="3343275"/>
             <wp:effectExtent l="0" t="0" r="0" b="9525"/>
             <wp:docPr id="1161749822" name="Picture 2" descr="A screenshot of a computer&#10;&#10;AI-generated content may be incorrect."/>
@@ -1894,6 +1883,65 @@
     </w:p>
     <w:p>
       <w:pPr>
+        <w:spacing w:after="60" w:line="240" w:lineRule="auto"/>
+        <w:rPr>
+          <w:rFonts w:ascii="Times New Roman" w:hAnsi="Times New Roman" w:cs="Times New Roman"/>
+          <w:color w:val="000000"/>
+          <w:sz w:val="26"/>
+        </w:rPr>
+      </w:pPr>
+      <w:r>
+        <w:rPr>
+          <w:rFonts w:ascii="Times New Roman" w:hAnsi="Times New Roman" w:cs="Times New Roman"/>
+          <w:noProof/>
+          <w:color w:val="000000"/>
+          <w:sz w:val="26"/>
+        </w:rPr>
+        <w:drawing>
+          <wp:inline distT="0" distB="0" distL="0" distR="0" wp14:anchorId="2F032E65" wp14:editId="3302237C">
+            <wp:extent cx="5943600" cy="3343275"/>
+            <wp:effectExtent l="0" t="0" r="0" b="9525"/>
+            <wp:docPr id="1804879254" name="Picture 1" descr="A screenshot of a computer&#10;&#10;AI-generated content may be incorrect."/>
+            <wp:cNvGraphicFramePr>
+              <a:graphicFrameLocks xmlns:a="http://schemas.openxmlformats.org/drawingml/2006/main" noChangeAspect="1"/>
+            </wp:cNvGraphicFramePr>
+            <a:graphic xmlns:a="http://schemas.openxmlformats.org/drawingml/2006/main">
+              <a:graphicData uri="http://schemas.openxmlformats.org/drawingml/2006/picture">
+                <pic:pic xmlns:pic="http://schemas.openxmlformats.org/drawingml/2006/picture">
+                  <pic:nvPicPr>
+                    <pic:cNvPr id="1804879254" name="Picture 1" descr="A screenshot of a computer&#10;&#10;AI-generated content may be incorrect."/>
+                    <pic:cNvPicPr/>
+                  </pic:nvPicPr>
+                  <pic:blipFill>
+                    <a:blip r:embed="rId7" cstate="print">
+                      <a:extLst>
+                        <a:ext uri="{28A0092B-C50C-407E-A947-70E740481C1C}">
+                          <a14:useLocalDpi xmlns:a14="http://schemas.microsoft.com/office/drawing/2010/main" val="0"/>
+                        </a:ext>
+                      </a:extLst>
+                    </a:blip>
+                    <a:stretch>
+                      <a:fillRect/>
+                    </a:stretch>
+                  </pic:blipFill>
+                  <pic:spPr>
+                    <a:xfrm>
+                      <a:off x="0" y="0"/>
+                      <a:ext cx="5943600" cy="3343275"/>
+                    </a:xfrm>
+                    <a:prstGeom prst="rect">
+                      <a:avLst/>
+                    </a:prstGeom>
+                  </pic:spPr>
+                </pic:pic>
+              </a:graphicData>
+            </a:graphic>
+          </wp:inline>
+        </w:drawing>
+      </w:r>
+    </w:p>
+    <w:p>
+      <w:pPr>
         <w:spacing w:before="160" w:after="80" w:line="240" w:lineRule="auto"/>
         <w:rPr>
           <w:rFonts w:ascii="Times New Roman" w:hAnsi="Times New Roman" w:cs="Times New Roman"/>
@@ -1943,6 +1991,7 @@
           <w:color w:val="000000"/>
           <w:sz w:val="26"/>
         </w:rPr>
+        <w:lastRenderedPageBreak/>
         <w:t>- Registry Run value (HKCU:\Software\Microsoft\Windows\CurrentVersion\Run): Khóa đăng ký này được hệ điều hành tự động quét và nạp thực thi mỗi khi phiên đăng nhập của người dùng tương ứng được thiết lập. Khi thêm giá trị vào đây, chương trình sẽ tự động chạy lại sau mỗi lần khởi động máy hoặc đăng nhập lại mà không cần người dùng thao tác.</w:t>
       </w:r>
     </w:p>
@@ -2015,16 +2064,126 @@
           <w:color w:val="000000"/>
           <w:sz w:val="26"/>
         </w:rPr>
-        <w:t xml:space="preserve">- Phát hiện các kỹ thuật ngụy trang tinh vi (Masquerading): Kẻ tấn công thường đặt tên entry rất giống tên tiến trình của Windows (như svchost, winlogon, SecurityUpdate) nhưng lại trỏ Image Path về một file độc hại trong thư mục tạm, hoặc chèn dòng lệnh </w:t>
-      </w:r>
-      <w:r>
-        <w:rPr>
-          <w:rFonts w:ascii="Times New Roman" w:hAnsi="Times New Roman" w:cs="Times New Roman"/>
+        <w:t>- Phát hiện các kỹ thuật ngụy trang tinh vi (Masquerading): Kẻ tấn công thường đặt tên entry rất giống tên tiến trình của Windows (như svchost, winlogon, SecurityUpdate) nhưng lại trỏ Image Path về một file độc hại trong thư mục tạm, hoặc chèn dòng lệnh thực thi PowerShell độc hại. Việc kiểm tra chéo Tên, Đường dẫn, Nhà phát hành (Publisher), Dòng lệnh tham số và Ngữ cảnh tài khoản tạo ra sẽ giúp phân biệt chính xác đâu là phần mềm hệ thống thật và đâu là mã độc ngụy trang.</w:t>
+      </w:r>
+    </w:p>
+    <w:p>
+      <w:pPr>
+        <w:spacing w:after="60" w:line="240" w:lineRule="auto"/>
+        <w:rPr>
+          <w:rFonts w:ascii="Times New Roman" w:hAnsi="Times New Roman" w:cs="Times New Roman"/>
+          <w:color w:val="000000"/>
+          <w:sz w:val="26"/>
+        </w:rPr>
+      </w:pPr>
+      <w:r>
+        <w:rPr>
+          <w:rFonts w:ascii="Times New Roman" w:hAnsi="Times New Roman" w:cs="Times New Roman"/>
+          <w:noProof/>
+          <w:color w:val="000000"/>
+          <w:sz w:val="26"/>
+        </w:rPr>
+        <w:drawing>
+          <wp:inline distT="0" distB="0" distL="0" distR="0" wp14:anchorId="14D9AF45" wp14:editId="4C6753AE">
+            <wp:extent cx="5943600" cy="3343275"/>
+            <wp:effectExtent l="0" t="0" r="0" b="9525"/>
+            <wp:docPr id="1421097207" name="Picture 2" descr="A screenshot of a computer&#10;&#10;AI-generated content may be incorrect."/>
+            <wp:cNvGraphicFramePr>
+              <a:graphicFrameLocks xmlns:a="http://schemas.openxmlformats.org/drawingml/2006/main" noChangeAspect="1"/>
+            </wp:cNvGraphicFramePr>
+            <a:graphic xmlns:a="http://schemas.openxmlformats.org/drawingml/2006/main">
+              <a:graphicData uri="http://schemas.openxmlformats.org/drawingml/2006/picture">
+                <pic:pic xmlns:pic="http://schemas.openxmlformats.org/drawingml/2006/picture">
+                  <pic:nvPicPr>
+                    <pic:cNvPr id="1421097207" name="Picture 2" descr="A screenshot of a computer&#10;&#10;AI-generated content may be incorrect."/>
+                    <pic:cNvPicPr/>
+                  </pic:nvPicPr>
+                  <pic:blipFill>
+                    <a:blip r:embed="rId8" cstate="print">
+                      <a:extLst>
+                        <a:ext uri="{28A0092B-C50C-407E-A947-70E740481C1C}">
+                          <a14:useLocalDpi xmlns:a14="http://schemas.microsoft.com/office/drawing/2010/main" val="0"/>
+                        </a:ext>
+                      </a:extLst>
+                    </a:blip>
+                    <a:stretch>
+                      <a:fillRect/>
+                    </a:stretch>
+                  </pic:blipFill>
+                  <pic:spPr>
+                    <a:xfrm>
+                      <a:off x="0" y="0"/>
+                      <a:ext cx="5943600" cy="3343275"/>
+                    </a:xfrm>
+                    <a:prstGeom prst="rect">
+                      <a:avLst/>
+                    </a:prstGeom>
+                  </pic:spPr>
+                </pic:pic>
+              </a:graphicData>
+            </a:graphic>
+          </wp:inline>
+        </w:drawing>
+      </w:r>
+    </w:p>
+    <w:p>
+      <w:pPr>
+        <w:spacing w:after="60" w:line="240" w:lineRule="auto"/>
+        <w:rPr>
+          <w:rFonts w:ascii="Times New Roman" w:hAnsi="Times New Roman" w:cs="Times New Roman"/>
+          <w:color w:val="000000"/>
+          <w:sz w:val="26"/>
+        </w:rPr>
+      </w:pPr>
+      <w:r>
+        <w:rPr>
+          <w:rFonts w:ascii="Times New Roman" w:hAnsi="Times New Roman" w:cs="Times New Roman"/>
+          <w:noProof/>
           <w:color w:val="000000"/>
           <w:sz w:val="26"/>
         </w:rPr>
         <w:lastRenderedPageBreak/>
-        <w:t>thực thi PowerShell độc hại. Việc kiểm tra chéo Tên, Đường dẫn, Nhà phát hành (Publisher), Dòng lệnh tham số và Ngữ cảnh tài khoản tạo ra sẽ giúp phân biệt chính xác đâu là phần mềm hệ thống thật và đâu là mã độc ngụy trang.</w:t>
+        <w:drawing>
+          <wp:inline distT="0" distB="0" distL="0" distR="0" wp14:anchorId="130486F1" wp14:editId="6657ABD1">
+            <wp:extent cx="5943600" cy="3343275"/>
+            <wp:effectExtent l="0" t="0" r="0" b="9525"/>
+            <wp:docPr id="2134818156" name="Picture 3" descr="A screenshot of a computer&#10;&#10;AI-generated content may be incorrect."/>
+            <wp:cNvGraphicFramePr>
+              <a:graphicFrameLocks xmlns:a="http://schemas.openxmlformats.org/drawingml/2006/main" noChangeAspect="1"/>
+            </wp:cNvGraphicFramePr>
+            <a:graphic xmlns:a="http://schemas.openxmlformats.org/drawingml/2006/main">
+              <a:graphicData uri="http://schemas.openxmlformats.org/drawingml/2006/picture">
+                <pic:pic xmlns:pic="http://schemas.openxmlformats.org/drawingml/2006/picture">
+                  <pic:nvPicPr>
+                    <pic:cNvPr id="2134818156" name="Picture 3" descr="A screenshot of a computer&#10;&#10;AI-generated content may be incorrect."/>
+                    <pic:cNvPicPr/>
+                  </pic:nvPicPr>
+                  <pic:blipFill>
+                    <a:blip r:embed="rId9" cstate="print">
+                      <a:extLst>
+                        <a:ext uri="{28A0092B-C50C-407E-A947-70E740481C1C}">
+                          <a14:useLocalDpi xmlns:a14="http://schemas.microsoft.com/office/drawing/2010/main" val="0"/>
+                        </a:ext>
+                      </a:extLst>
+                    </a:blip>
+                    <a:stretch>
+                      <a:fillRect/>
+                    </a:stretch>
+                  </pic:blipFill>
+                  <pic:spPr>
+                    <a:xfrm>
+                      <a:off x="0" y="0"/>
+                      <a:ext cx="5943600" cy="3343275"/>
+                    </a:xfrm>
+                    <a:prstGeom prst="rect">
+                      <a:avLst/>
+                    </a:prstGeom>
+                  </pic:spPr>
+                </pic:pic>
+              </a:graphicData>
+            </a:graphic>
+          </wp:inline>
+        </w:drawing>
       </w:r>
     </w:p>
     <w:p>
@@ -2173,6 +2332,65 @@
     </w:p>
     <w:p>
       <w:pPr>
+        <w:spacing w:after="60" w:line="240" w:lineRule="auto"/>
+        <w:rPr>
+          <w:rFonts w:ascii="Times New Roman" w:hAnsi="Times New Roman" w:cs="Times New Roman"/>
+          <w:color w:val="000000"/>
+          <w:sz w:val="26"/>
+        </w:rPr>
+      </w:pPr>
+      <w:r>
+        <w:rPr>
+          <w:rFonts w:ascii="Times New Roman" w:hAnsi="Times New Roman" w:cs="Times New Roman"/>
+          <w:noProof/>
+          <w:color w:val="000000"/>
+          <w:sz w:val="26"/>
+        </w:rPr>
+        <w:drawing>
+          <wp:inline distT="0" distB="0" distL="0" distR="0" wp14:anchorId="5F837D11" wp14:editId="61D59F7C">
+            <wp:extent cx="5943600" cy="3343275"/>
+            <wp:effectExtent l="0" t="0" r="0" b="9525"/>
+            <wp:docPr id="138153969" name="Picture 8" descr="A screenshot of a computer screen&#10;&#10;AI-generated content may be incorrect."/>
+            <wp:cNvGraphicFramePr>
+              <a:graphicFrameLocks xmlns:a="http://schemas.openxmlformats.org/drawingml/2006/main" noChangeAspect="1"/>
+            </wp:cNvGraphicFramePr>
+            <a:graphic xmlns:a="http://schemas.openxmlformats.org/drawingml/2006/main">
+              <a:graphicData uri="http://schemas.openxmlformats.org/drawingml/2006/picture">
+                <pic:pic xmlns:pic="http://schemas.openxmlformats.org/drawingml/2006/picture">
+                  <pic:nvPicPr>
+                    <pic:cNvPr id="138153969" name="Picture 8" descr="A screenshot of a computer screen&#10;&#10;AI-generated content may be incorrect."/>
+                    <pic:cNvPicPr/>
+                  </pic:nvPicPr>
+                  <pic:blipFill>
+                    <a:blip r:embed="rId10" cstate="print">
+                      <a:extLst>
+                        <a:ext uri="{28A0092B-C50C-407E-A947-70E740481C1C}">
+                          <a14:useLocalDpi xmlns:a14="http://schemas.microsoft.com/office/drawing/2010/main" val="0"/>
+                        </a:ext>
+                      </a:extLst>
+                    </a:blip>
+                    <a:stretch>
+                      <a:fillRect/>
+                    </a:stretch>
+                  </pic:blipFill>
+                  <pic:spPr>
+                    <a:xfrm>
+                      <a:off x="0" y="0"/>
+                      <a:ext cx="5943600" cy="3343275"/>
+                    </a:xfrm>
+                    <a:prstGeom prst="rect">
+                      <a:avLst/>
+                    </a:prstGeom>
+                  </pic:spPr>
+                </pic:pic>
+              </a:graphicData>
+            </a:graphic>
+          </wp:inline>
+        </w:drawing>
+      </w:r>
+    </w:p>
+    <w:p>
+      <w:pPr>
         <w:spacing w:before="160" w:after="80" w:line="240" w:lineRule="auto"/>
         <w:rPr>
           <w:rFonts w:ascii="Times New Roman" w:hAnsi="Times New Roman" w:cs="Times New Roman"/>
@@ -2276,16 +2494,7 @@
           <w:color w:val="000000"/>
           <w:sz w:val="26"/>
         </w:rPr>
-        <w:t xml:space="preserve">- 1. Tần suất gửi thư theo địa chỉ người gửi (Message Count per Sender): Số lượng thư gửi đi từ cùng một tài khoản email (Sender) hoặc cùng một địa chỉ IP nguồn trong một </w:t>
-      </w:r>
-      <w:r>
-        <w:rPr>
-          <w:rFonts w:ascii="Times New Roman" w:hAnsi="Times New Roman" w:cs="Times New Roman"/>
-          <w:color w:val="000000"/>
-          <w:sz w:val="26"/>
-        </w:rPr>
-        <w:lastRenderedPageBreak/>
-        <w:t>đơn vị thời gian ngắn vượt trội bất thường so với mức gửi thông thường của người dùng cá nhân.</w:t>
+        <w:t>- 1. Tần suất gửi thư theo địa chỉ người gửi (Message Count per Sender): Số lượng thư gửi đi từ cùng một tài khoản email (Sender) hoặc cùng một địa chỉ IP nguồn trong một đơn vị thời gian ngắn vượt trội bất thường so với mức gửi thông thường của người dùng cá nhân.</w:t>
       </w:r>
     </w:p>
     <w:p>
@@ -2308,6 +2517,65 @@
     </w:p>
     <w:p>
       <w:pPr>
+        <w:spacing w:after="60" w:line="240" w:lineRule="auto"/>
+        <w:rPr>
+          <w:rFonts w:ascii="Times New Roman" w:hAnsi="Times New Roman" w:cs="Times New Roman"/>
+          <w:color w:val="000000"/>
+          <w:sz w:val="26"/>
+        </w:rPr>
+      </w:pPr>
+      <w:r>
+        <w:rPr>
+          <w:rFonts w:ascii="Times New Roman" w:hAnsi="Times New Roman" w:cs="Times New Roman"/>
+          <w:noProof/>
+          <w:color w:val="000000"/>
+          <w:sz w:val="26"/>
+        </w:rPr>
+        <w:drawing>
+          <wp:inline distT="0" distB="0" distL="0" distR="0" wp14:anchorId="2E7E530A" wp14:editId="43E275FF">
+            <wp:extent cx="5943600" cy="3343275"/>
+            <wp:effectExtent l="0" t="0" r="0" b="9525"/>
+            <wp:docPr id="65717524" name="Picture 7" descr="A screenshot of a computer screen&#10;&#10;AI-generated content may be incorrect."/>
+            <wp:cNvGraphicFramePr>
+              <a:graphicFrameLocks xmlns:a="http://schemas.openxmlformats.org/drawingml/2006/main" noChangeAspect="1"/>
+            </wp:cNvGraphicFramePr>
+            <a:graphic xmlns:a="http://schemas.openxmlformats.org/drawingml/2006/main">
+              <a:graphicData uri="http://schemas.openxmlformats.org/drawingml/2006/picture">
+                <pic:pic xmlns:pic="http://schemas.openxmlformats.org/drawingml/2006/picture">
+                  <pic:nvPicPr>
+                    <pic:cNvPr id="65717524" name="Picture 7" descr="A screenshot of a computer screen&#10;&#10;AI-generated content may be incorrect."/>
+                    <pic:cNvPicPr/>
+                  </pic:nvPicPr>
+                  <pic:blipFill>
+                    <a:blip r:embed="rId10" cstate="print">
+                      <a:extLst>
+                        <a:ext uri="{28A0092B-C50C-407E-A947-70E740481C1C}">
+                          <a14:useLocalDpi xmlns:a14="http://schemas.microsoft.com/office/drawing/2010/main" val="0"/>
+                        </a:ext>
+                      </a:extLst>
+                    </a:blip>
+                    <a:stretch>
+                      <a:fillRect/>
+                    </a:stretch>
+                  </pic:blipFill>
+                  <pic:spPr>
+                    <a:xfrm>
+                      <a:off x="0" y="0"/>
+                      <a:ext cx="5943600" cy="3343275"/>
+                    </a:xfrm>
+                    <a:prstGeom prst="rect">
+                      <a:avLst/>
+                    </a:prstGeom>
+                  </pic:spPr>
+                </pic:pic>
+              </a:graphicData>
+            </a:graphic>
+          </wp:inline>
+        </w:drawing>
+      </w:r>
+    </w:p>
+    <w:p>
+      <w:pPr>
         <w:spacing w:before="160" w:after="80" w:line="240" w:lineRule="auto"/>
         <w:rPr>
           <w:rFonts w:ascii="Times New Roman" w:hAnsi="Times New Roman" w:cs="Times New Roman"/>
@@ -2434,6 +2702,124 @@
     </w:p>
     <w:p>
       <w:pPr>
+        <w:spacing w:after="60" w:line="240" w:lineRule="auto"/>
+        <w:rPr>
+          <w:rFonts w:ascii="Times New Roman" w:hAnsi="Times New Roman" w:cs="Times New Roman"/>
+          <w:color w:val="000000"/>
+          <w:sz w:val="26"/>
+        </w:rPr>
+      </w:pPr>
+      <w:r>
+        <w:rPr>
+          <w:rFonts w:ascii="Times New Roman" w:hAnsi="Times New Roman" w:cs="Times New Roman"/>
+          <w:noProof/>
+          <w:color w:val="000000"/>
+          <w:sz w:val="26"/>
+        </w:rPr>
+        <w:drawing>
+          <wp:inline distT="0" distB="0" distL="0" distR="0" wp14:anchorId="6F1F9796" wp14:editId="1560C58B">
+            <wp:extent cx="5943600" cy="3343275"/>
+            <wp:effectExtent l="0" t="0" r="0" b="9525"/>
+            <wp:docPr id="442807792" name="Picture 4" descr="A screenshot of a computer&#10;&#10;AI-generated content may be incorrect."/>
+            <wp:cNvGraphicFramePr>
+              <a:graphicFrameLocks xmlns:a="http://schemas.openxmlformats.org/drawingml/2006/main" noChangeAspect="1"/>
+            </wp:cNvGraphicFramePr>
+            <a:graphic xmlns:a="http://schemas.openxmlformats.org/drawingml/2006/main">
+              <a:graphicData uri="http://schemas.openxmlformats.org/drawingml/2006/picture">
+                <pic:pic xmlns:pic="http://schemas.openxmlformats.org/drawingml/2006/picture">
+                  <pic:nvPicPr>
+                    <pic:cNvPr id="442807792" name="Picture 4" descr="A screenshot of a computer&#10;&#10;AI-generated content may be incorrect."/>
+                    <pic:cNvPicPr/>
+                  </pic:nvPicPr>
+                  <pic:blipFill>
+                    <a:blip r:embed="rId11" cstate="print">
+                      <a:extLst>
+                        <a:ext uri="{28A0092B-C50C-407E-A947-70E740481C1C}">
+                          <a14:useLocalDpi xmlns:a14="http://schemas.microsoft.com/office/drawing/2010/main" val="0"/>
+                        </a:ext>
+                      </a:extLst>
+                    </a:blip>
+                    <a:stretch>
+                      <a:fillRect/>
+                    </a:stretch>
+                  </pic:blipFill>
+                  <pic:spPr>
+                    <a:xfrm>
+                      <a:off x="0" y="0"/>
+                      <a:ext cx="5943600" cy="3343275"/>
+                    </a:xfrm>
+                    <a:prstGeom prst="rect">
+                      <a:avLst/>
+                    </a:prstGeom>
+                  </pic:spPr>
+                </pic:pic>
+              </a:graphicData>
+            </a:graphic>
+          </wp:inline>
+        </w:drawing>
+      </w:r>
+    </w:p>
+    <w:p>
+      <w:pPr>
+        <w:spacing w:after="60" w:line="240" w:lineRule="auto"/>
+        <w:rPr>
+          <w:rFonts w:ascii="Times New Roman" w:hAnsi="Times New Roman" w:cs="Times New Roman"/>
+          <w:color w:val="000000"/>
+          <w:sz w:val="26"/>
+        </w:rPr>
+      </w:pPr>
+      <w:r>
+        <w:rPr>
+          <w:rFonts w:ascii="Times New Roman" w:hAnsi="Times New Roman" w:cs="Times New Roman"/>
+          <w:noProof/>
+          <w:color w:val="000000"/>
+          <w:sz w:val="26"/>
+        </w:rPr>
+        <w:drawing>
+          <wp:inline distT="0" distB="0" distL="0" distR="0" wp14:anchorId="69293C4A" wp14:editId="6F6BCB3D">
+            <wp:extent cx="5943600" cy="3343275"/>
+            <wp:effectExtent l="0" t="0" r="0" b="9525"/>
+            <wp:docPr id="1370709741" name="Picture 6" descr="A screenshot of a computer&#10;&#10;AI-generated content may be incorrect."/>
+            <wp:cNvGraphicFramePr>
+              <a:graphicFrameLocks xmlns:a="http://schemas.openxmlformats.org/drawingml/2006/main" noChangeAspect="1"/>
+            </wp:cNvGraphicFramePr>
+            <a:graphic xmlns:a="http://schemas.openxmlformats.org/drawingml/2006/main">
+              <a:graphicData uri="http://schemas.openxmlformats.org/drawingml/2006/picture">
+                <pic:pic xmlns:pic="http://schemas.openxmlformats.org/drawingml/2006/picture">
+                  <pic:nvPicPr>
+                    <pic:cNvPr id="1370709741" name="Picture 6" descr="A screenshot of a computer&#10;&#10;AI-generated content may be incorrect."/>
+                    <pic:cNvPicPr/>
+                  </pic:nvPicPr>
+                  <pic:blipFill>
+                    <a:blip r:embed="rId12" cstate="print">
+                      <a:extLst>
+                        <a:ext uri="{28A0092B-C50C-407E-A947-70E740481C1C}">
+                          <a14:useLocalDpi xmlns:a14="http://schemas.microsoft.com/office/drawing/2010/main" val="0"/>
+                        </a:ext>
+                      </a:extLst>
+                    </a:blip>
+                    <a:stretch>
+                      <a:fillRect/>
+                    </a:stretch>
+                  </pic:blipFill>
+                  <pic:spPr>
+                    <a:xfrm>
+                      <a:off x="0" y="0"/>
+                      <a:ext cx="5943600" cy="3343275"/>
+                    </a:xfrm>
+                    <a:prstGeom prst="rect">
+                      <a:avLst/>
+                    </a:prstGeom>
+                  </pic:spPr>
+                </pic:pic>
+              </a:graphicData>
+            </a:graphic>
+          </wp:inline>
+        </w:drawing>
+      </w:r>
+    </w:p>
+    <w:p>
+      <w:pPr>
         <w:spacing w:before="160" w:after="80" w:line="240" w:lineRule="auto"/>
         <w:rPr>
           <w:rFonts w:ascii="Times New Roman" w:hAnsi="Times New Roman" w:cs="Times New Roman"/>
@@ -2519,7 +2905,6 @@
           <w:color w:val="000000"/>
           <w:sz w:val="26"/>
         </w:rPr>
-        <w:lastRenderedPageBreak/>
         <w:t>- Session Hijacking: Kẻ tấn công chiếm đoạt mã định danh phiên làm việc (Session Token / Cookie) hợp lệ của người dùng sau khi họ đã xác thực thành công, từ đó mạo danh người dùng truy cập trực tiếp vào hệ thống mà không cần mật khẩu.</w:t>
       </w:r>
     </w:p>
@@ -2754,7 +3139,6 @@
           <w:color w:val="000000"/>
           <w:sz w:val="28"/>
         </w:rPr>
-        <w:lastRenderedPageBreak/>
         <w:t>Câu 15: Phân biệt spoofing ở lớp IP, DNS và website/domain. Với mỗi loại, nêu một nguồn bằng chứng hoặc kiểm soát phù hợp.</w:t>
       </w:r>
     </w:p>
@@ -3007,7 +3391,6 @@
           <w:color w:val="000000"/>
           <w:sz w:val="26"/>
         </w:rPr>
-        <w:lastRenderedPageBreak/>
         <w:t>- Case SE05: Kẻ xấu hứa tặng quà/ưu đãi nếu người dùng cung cấp thông tin hoặc thực hiện một hành động -&gt; Quid Pro Quo (Đổi chác có đi có lại, hứa hẹn trao đổi một lợi ích hoặc dịch vụ cụ thể để đổi lấy quyền truy cập hoặc dữ liệu của người dùng).</w:t>
       </w:r>
     </w:p>
@@ -3031,6 +3414,65 @@
     </w:p>
     <w:p>
       <w:pPr>
+        <w:spacing w:after="60" w:line="240" w:lineRule="auto"/>
+        <w:rPr>
+          <w:rFonts w:ascii="Times New Roman" w:hAnsi="Times New Roman" w:cs="Times New Roman"/>
+          <w:color w:val="000000"/>
+          <w:sz w:val="26"/>
+        </w:rPr>
+      </w:pPr>
+      <w:r>
+        <w:rPr>
+          <w:rFonts w:ascii="Times New Roman" w:hAnsi="Times New Roman" w:cs="Times New Roman"/>
+          <w:noProof/>
+          <w:color w:val="000000"/>
+          <w:sz w:val="26"/>
+        </w:rPr>
+        <w:drawing>
+          <wp:inline distT="0" distB="0" distL="0" distR="0" wp14:anchorId="6EAA631D" wp14:editId="5BE38E99">
+            <wp:extent cx="5943600" cy="3343275"/>
+            <wp:effectExtent l="0" t="0" r="0" b="9525"/>
+            <wp:docPr id="860594214" name="Picture 9" descr="A screenshot of a computer&#10;&#10;AI-generated content may be incorrect."/>
+            <wp:cNvGraphicFramePr>
+              <a:graphicFrameLocks xmlns:a="http://schemas.openxmlformats.org/drawingml/2006/main" noChangeAspect="1"/>
+            </wp:cNvGraphicFramePr>
+            <a:graphic xmlns:a="http://schemas.openxmlformats.org/drawingml/2006/main">
+              <a:graphicData uri="http://schemas.openxmlformats.org/drawingml/2006/picture">
+                <pic:pic xmlns:pic="http://schemas.openxmlformats.org/drawingml/2006/picture">
+                  <pic:nvPicPr>
+                    <pic:cNvPr id="860594214" name="Picture 9" descr="A screenshot of a computer&#10;&#10;AI-generated content may be incorrect."/>
+                    <pic:cNvPicPr/>
+                  </pic:nvPicPr>
+                  <pic:blipFill>
+                    <a:blip r:embed="rId13" cstate="print">
+                      <a:extLst>
+                        <a:ext uri="{28A0092B-C50C-407E-A947-70E740481C1C}">
+                          <a14:useLocalDpi xmlns:a14="http://schemas.microsoft.com/office/drawing/2010/main" val="0"/>
+                        </a:ext>
+                      </a:extLst>
+                    </a:blip>
+                    <a:stretch>
+                      <a:fillRect/>
+                    </a:stretch>
+                  </pic:blipFill>
+                  <pic:spPr>
+                    <a:xfrm>
+                      <a:off x="0" y="0"/>
+                      <a:ext cx="5943600" cy="3343275"/>
+                    </a:xfrm>
+                    <a:prstGeom prst="rect">
+                      <a:avLst/>
+                    </a:prstGeom>
+                  </pic:spPr>
+                </pic:pic>
+              </a:graphicData>
+            </a:graphic>
+          </wp:inline>
+        </w:drawing>
+      </w:r>
+    </w:p>
+    <w:p>
+      <w:pPr>
         <w:spacing w:before="160" w:after="80" w:line="240" w:lineRule="auto"/>
         <w:rPr>
           <w:rFonts w:ascii="Times New Roman" w:hAnsi="Times New Roman" w:cs="Times New Roman"/>
@@ -3157,6 +3599,65 @@
     </w:p>
     <w:p>
       <w:pPr>
+        <w:spacing w:after="60" w:line="240" w:lineRule="auto"/>
+        <w:rPr>
+          <w:rFonts w:ascii="Times New Roman" w:hAnsi="Times New Roman" w:cs="Times New Roman"/>
+          <w:color w:val="000000"/>
+          <w:sz w:val="26"/>
+        </w:rPr>
+      </w:pPr>
+      <w:r>
+        <w:rPr>
+          <w:rFonts w:ascii="Times New Roman" w:hAnsi="Times New Roman" w:cs="Times New Roman"/>
+          <w:noProof/>
+          <w:color w:val="000000"/>
+          <w:sz w:val="26"/>
+        </w:rPr>
+        <w:drawing>
+          <wp:inline distT="0" distB="0" distL="0" distR="0" wp14:anchorId="7C461E4C" wp14:editId="32A0BF9C">
+            <wp:extent cx="5943600" cy="3343275"/>
+            <wp:effectExtent l="0" t="0" r="0" b="9525"/>
+            <wp:docPr id="571039335" name="Picture 10" descr="A screenshot of a computer&#10;&#10;AI-generated content may be incorrect."/>
+            <wp:cNvGraphicFramePr>
+              <a:graphicFrameLocks xmlns:a="http://schemas.openxmlformats.org/drawingml/2006/main" noChangeAspect="1"/>
+            </wp:cNvGraphicFramePr>
+            <a:graphic xmlns:a="http://schemas.openxmlformats.org/drawingml/2006/main">
+              <a:graphicData uri="http://schemas.openxmlformats.org/drawingml/2006/picture">
+                <pic:pic xmlns:pic="http://schemas.openxmlformats.org/drawingml/2006/picture">
+                  <pic:nvPicPr>
+                    <pic:cNvPr id="571039335" name="Picture 10" descr="A screenshot of a computer&#10;&#10;AI-generated content may be incorrect."/>
+                    <pic:cNvPicPr/>
+                  </pic:nvPicPr>
+                  <pic:blipFill>
+                    <a:blip r:embed="rId13" cstate="print">
+                      <a:extLst>
+                        <a:ext uri="{28A0092B-C50C-407E-A947-70E740481C1C}">
+                          <a14:useLocalDpi xmlns:a14="http://schemas.microsoft.com/office/drawing/2010/main" val="0"/>
+                        </a:ext>
+                      </a:extLst>
+                    </a:blip>
+                    <a:stretch>
+                      <a:fillRect/>
+                    </a:stretch>
+                  </pic:blipFill>
+                  <pic:spPr>
+                    <a:xfrm>
+                      <a:off x="0" y="0"/>
+                      <a:ext cx="5943600" cy="3343275"/>
+                    </a:xfrm>
+                    <a:prstGeom prst="rect">
+                      <a:avLst/>
+                    </a:prstGeom>
+                  </pic:spPr>
+                </pic:pic>
+              </a:graphicData>
+            </a:graphic>
+          </wp:inline>
+        </w:drawing>
+      </w:r>
+    </w:p>
+    <w:p>
+      <w:pPr>
         <w:spacing w:before="160" w:after="80" w:line="240" w:lineRule="auto"/>
         <w:rPr>
           <w:rFonts w:ascii="Times New Roman" w:hAnsi="Times New Roman" w:cs="Times New Roman"/>
@@ -3356,7 +3857,6 @@
           <w:color w:val="000000"/>
           <w:sz w:val="26"/>
         </w:rPr>
-        <w:lastRenderedPageBreak/>
         <w:t>- Giai đoạn 4 - Credential Action (Xử lý thông tin xác thực): Thu hồi tất cả các phiên đăng nhập đang hoạt động của các tài khoản từng đăng nhập trên máy; tiến hành đổi mật khẩu bắt buộc cho toàn bộ tài khoản đó từ một thiết bị sạch khác; kích hoạt bắt buộc xác thực đa yếu tố (MFA/FIDO2).</w:t>
       </w:r>
     </w:p>
@@ -3591,7 +4091,6 @@
           <w:color w:val="000000"/>
           <w:sz w:val="26"/>
         </w:rPr>
-        <w:lastRenderedPageBreak/>
         <w:t>- 2. Least Privilege (Nguyên tắc đặc quyền tối thiểu): Nhân viên kế toán và quản trị chỉ sử dụng tài khoản người dùng tiêu chuẩn (Standard User) trong công việc hàng ngày, chỉ nâng quyền khi cần thiết; quản lý mật khẩu quản trị viên cục bộ bằng giải pháp tự động như Microsoft LAPS.</w:t>
       </w:r>
     </w:p>
@@ -3694,6 +4193,55 @@
           <w:sz w:val="26"/>
         </w:rPr>
       </w:pPr>
+      <w:r>
+        <w:rPr>
+          <w:rFonts w:ascii="Times New Roman" w:hAnsi="Times New Roman" w:cs="Times New Roman"/>
+          <w:noProof/>
+          <w:color w:val="000000"/>
+          <w:sz w:val="26"/>
+        </w:rPr>
+        <w:drawing>
+          <wp:inline distT="0" distB="0" distL="0" distR="0" wp14:anchorId="63EA7ACA" wp14:editId="1C4C6FEF">
+            <wp:extent cx="5943600" cy="3239770"/>
+            <wp:effectExtent l="0" t="0" r="0" b="0"/>
+            <wp:docPr id="669233061" name="Picture 11" descr="A screenshot of a computer&#10;&#10;AI-generated content may be incorrect."/>
+            <wp:cNvGraphicFramePr>
+              <a:graphicFrameLocks xmlns:a="http://schemas.openxmlformats.org/drawingml/2006/main" noChangeAspect="1"/>
+            </wp:cNvGraphicFramePr>
+            <a:graphic xmlns:a="http://schemas.openxmlformats.org/drawingml/2006/main">
+              <a:graphicData uri="http://schemas.openxmlformats.org/drawingml/2006/picture">
+                <pic:pic xmlns:pic="http://schemas.openxmlformats.org/drawingml/2006/picture">
+                  <pic:nvPicPr>
+                    <pic:cNvPr id="669233061" name="Picture 11" descr="A screenshot of a computer&#10;&#10;AI-generated content may be incorrect."/>
+                    <pic:cNvPicPr/>
+                  </pic:nvPicPr>
+                  <pic:blipFill>
+                    <a:blip r:embed="rId14">
+                      <a:extLst>
+                        <a:ext uri="{28A0092B-C50C-407E-A947-70E740481C1C}">
+                          <a14:useLocalDpi xmlns:a14="http://schemas.microsoft.com/office/drawing/2010/main" val="0"/>
+                        </a:ext>
+                      </a:extLst>
+                    </a:blip>
+                    <a:stretch>
+                      <a:fillRect/>
+                    </a:stretch>
+                  </pic:blipFill>
+                  <pic:spPr>
+                    <a:xfrm>
+                      <a:off x="0" y="0"/>
+                      <a:ext cx="5943600" cy="3239770"/>
+                    </a:xfrm>
+                    <a:prstGeom prst="rect">
+                      <a:avLst/>
+                    </a:prstGeom>
+                  </pic:spPr>
+                </pic:pic>
+              </a:graphicData>
+            </a:graphic>
+          </wp:inline>
+        </w:drawing>
+      </w:r>
     </w:p>
     <w:sectPr>
       <w:pgSz w:w="12240" w:h="15840"/>

</xml_diff>